<commit_message>
Creating UploadFile TODO: continue handing the file
</commit_message>
<xml_diff>
--- a/פרויקט פולסטק מסמך אפיון.docx
+++ b/פרויקט פולסטק מסמך אפיון.docx
@@ -46,6 +46,28 @@
     <w:p>
       <w:pPr>
         <w:rPr>
+          <w:rFonts w:ascii="Rubik" w:hAnsi="Rubik" w:cs="Rubik"/>
+          <w:b/>
+          <w:bCs/>
+          <w:sz w:val="20"/>
+          <w:szCs w:val="20"/>
+          <w:rtl/>
+        </w:rPr>
+      </w:pPr>
+    </w:p>
+    <w:p>
+      <w:pPr>
+        <w:rPr>
+          <w:rFonts w:ascii="Rubik" w:hAnsi="Rubik" w:cs="Rubik"/>
+          <w:b/>
+          <w:bCs/>
+          <w:sz w:val="20"/>
+          <w:szCs w:val="20"/>
+          <w:rtl/>
+        </w:rPr>
+      </w:pPr>
+      <w:r>
+        <w:rPr>
           <w:rFonts w:ascii="Rubik" w:hAnsi="Rubik" w:cs="Rubik" w:hint="cs"/>
           <w:b/>
           <w:bCs/>
@@ -53,19 +75,19 @@
           <w:szCs w:val="20"/>
           <w:rtl/>
         </w:rPr>
-      </w:pPr>
-    </w:p>
-    <w:p>
-      <w:pPr>
-        <w:rPr>
-          <w:rFonts w:ascii="Rubik" w:hAnsi="Rubik" w:cs="Rubik"/>
+        <w:t>תיאו</w:t>
+      </w:r>
+      <w:r>
+        <w:rPr>
+          <w:rFonts w:ascii="Rubik" w:hAnsi="Rubik" w:cs="Rubik" w:hint="eastAsia"/>
           <w:b/>
           <w:bCs/>
           <w:sz w:val="20"/>
           <w:szCs w:val="20"/>
           <w:rtl/>
         </w:rPr>
-      </w:pPr>
+        <w:t>ר</w:t>
+      </w:r>
       <w:r>
         <w:rPr>
           <w:rFonts w:ascii="Rubik" w:hAnsi="Rubik" w:cs="Rubik" w:hint="cs"/>
@@ -75,28 +97,6 @@
           <w:szCs w:val="20"/>
           <w:rtl/>
         </w:rPr>
-        <w:t>תיאו</w:t>
-      </w:r>
-      <w:r>
-        <w:rPr>
-          <w:rFonts w:ascii="Rubik" w:hAnsi="Rubik" w:cs="Rubik" w:hint="eastAsia"/>
-          <w:b/>
-          <w:bCs/>
-          <w:sz w:val="20"/>
-          <w:szCs w:val="20"/>
-          <w:rtl/>
-        </w:rPr>
-        <w:t>ר</w:t>
-      </w:r>
-      <w:r>
-        <w:rPr>
-          <w:rFonts w:ascii="Rubik" w:hAnsi="Rubik" w:cs="Rubik" w:hint="cs"/>
-          <w:b/>
-          <w:bCs/>
-          <w:sz w:val="20"/>
-          <w:szCs w:val="20"/>
-          <w:rtl/>
-        </w:rPr>
         <w:t xml:space="preserve"> המערכת:</w:t>
       </w:r>
     </w:p>
@@ -212,7 +212,7 @@
     <w:p>
       <w:pPr>
         <w:rPr>
-          <w:rFonts w:ascii="Rubik" w:hAnsi="Rubik" w:cs="Rubik"/>
+          <w:rFonts w:ascii="Rubik" w:hAnsi="Rubik" w:cs="Rubik" w:hint="cs"/>
           <w:b/>
           <w:bCs/>
           <w:sz w:val="20"/>
@@ -2009,7 +2009,7 @@
     <w:p>
       <w:pPr>
         <w:rPr>
-          <w:rFonts w:ascii="Rubik" w:hAnsi="Rubik" w:cs="Rubik" w:hint="cs"/>
+          <w:rFonts w:ascii="Rubik" w:hAnsi="Rubik" w:cs="Rubik"/>
           <w:sz w:val="20"/>
           <w:szCs w:val="20"/>
           <w:rtl/>
@@ -3764,11 +3764,11 @@
         <w:tblLook w:val="04A0" w:firstRow="1" w:lastRow="0" w:firstColumn="1" w:lastColumn="0" w:noHBand="0" w:noVBand="1"/>
       </w:tblPr>
       <w:tblGrid>
-        <w:gridCol w:w="1620"/>
+        <w:gridCol w:w="1705"/>
         <w:gridCol w:w="1588"/>
         <w:gridCol w:w="1971"/>
-        <w:gridCol w:w="1543"/>
-        <w:gridCol w:w="1574"/>
+        <w:gridCol w:w="1605"/>
+        <w:gridCol w:w="1653"/>
       </w:tblGrid>
       <w:tr>
         <w:tc>
@@ -3972,7 +3972,6 @@
                 <w:szCs w:val="16"/>
                 <w:rtl/>
               </w:rPr>
-              <w:lastRenderedPageBreak/>
               <w:t>רישום משתמש</w:t>
             </w:r>
             <w:r>
@@ -4013,7 +4012,16 @@
                 <w:sz w:val="16"/>
                 <w:szCs w:val="16"/>
               </w:rPr>
-              <w:t>POST /api/register</w:t>
+              <w:t xml:space="preserve">POST </w:t>
+            </w:r>
+            <w:r>
+              <w:rPr>
+                <w:rFonts w:ascii="Rubik" w:hAnsi="Rubik" w:cs="Rubik"/>
+                <w:sz w:val="16"/>
+                <w:szCs w:val="16"/>
+              </w:rPr>
+              <w:lastRenderedPageBreak/>
+              <w:t>/api/register</w:t>
             </w:r>
           </w:p>
         </w:tc>
@@ -4043,7 +4051,17 @@
                 <w:sz w:val="16"/>
                 <w:szCs w:val="16"/>
               </w:rPr>
-              <w:t>Body: { username: string, password: string, role: string }</w:t>
+              <w:lastRenderedPageBreak/>
+              <w:t xml:space="preserve">Body: { username: </w:t>
+            </w:r>
+            <w:r>
+              <w:rPr>
+                <w:rFonts w:ascii="Rubik" w:hAnsi="Rubik" w:cs="Rubik"/>
+                <w:sz w:val="16"/>
+                <w:szCs w:val="16"/>
+              </w:rPr>
+              <w:lastRenderedPageBreak/>
+              <w:t>string, password: string, role: string }</w:t>
             </w:r>
           </w:p>
         </w:tc>
@@ -4074,7 +4092,17 @@
                 <w:sz w:val="16"/>
                 <w:szCs w:val="16"/>
               </w:rPr>
-              <w:t>data: { userId: string, message: string }</w:t>
+              <w:lastRenderedPageBreak/>
+              <w:t xml:space="preserve">data: { userId: </w:t>
+            </w:r>
+            <w:r>
+              <w:rPr>
+                <w:rFonts w:ascii="Rubik" w:hAnsi="Rubik" w:cs="Rubik"/>
+                <w:sz w:val="16"/>
+                <w:szCs w:val="16"/>
+              </w:rPr>
+              <w:lastRenderedPageBreak/>
+              <w:t>string, message: string }</w:t>
             </w:r>
           </w:p>
         </w:tc>
@@ -4106,7 +4134,18 @@
                 <w:szCs w:val="16"/>
                 <w:rtl/>
               </w:rPr>
-              <w:t>יצירת משתמש חדש במסד הנתונים עם תפקיד מוגדר</w:t>
+              <w:lastRenderedPageBreak/>
+              <w:t xml:space="preserve">יצירת משתמש חדש </w:t>
+            </w:r>
+            <w:r>
+              <w:rPr>
+                <w:rFonts w:ascii="Rubik" w:hAnsi="Rubik" w:cs="Rubik"/>
+                <w:sz w:val="16"/>
+                <w:szCs w:val="16"/>
+                <w:rtl/>
+              </w:rPr>
+              <w:lastRenderedPageBreak/>
+              <w:t>במסד הנתונים עם תפקיד מוגדר</w:t>
             </w:r>
             <w:r>
               <w:rPr>
@@ -4159,6 +4198,7 @@
                 <w:szCs w:val="16"/>
                 <w:rtl/>
               </w:rPr>
+              <w:lastRenderedPageBreak/>
               <w:t>כניסת משתמש</w:t>
             </w:r>
           </w:p>
@@ -5744,6 +5784,42 @@
         </w:rPr>
         <w:t> </w:t>
       </w:r>
+    </w:p>
+    <w:p>
+      <w:pPr>
+        <w:rPr>
+          <w:rFonts w:ascii="Rubik" w:hAnsi="Rubik" w:cs="Rubik"/>
+          <w:b/>
+          <w:bCs/>
+          <w:sz w:val="20"/>
+          <w:szCs w:val="20"/>
+          <w:rtl/>
+        </w:rPr>
+      </w:pPr>
+    </w:p>
+    <w:p>
+      <w:pPr>
+        <w:rPr>
+          <w:rFonts w:ascii="Rubik" w:hAnsi="Rubik" w:cs="Rubik"/>
+          <w:b/>
+          <w:bCs/>
+          <w:sz w:val="20"/>
+          <w:szCs w:val="20"/>
+          <w:rtl/>
+        </w:rPr>
+      </w:pPr>
+    </w:p>
+    <w:p>
+      <w:pPr>
+        <w:rPr>
+          <w:rFonts w:ascii="Rubik" w:hAnsi="Rubik" w:cs="Rubik"/>
+          <w:b/>
+          <w:bCs/>
+          <w:sz w:val="20"/>
+          <w:szCs w:val="20"/>
+          <w:rtl/>
+        </w:rPr>
+      </w:pPr>
     </w:p>
     <w:p>
       <w:pPr>
@@ -5891,7 +5967,6 @@
                 <w:szCs w:val="20"/>
                 <w:rtl/>
               </w:rPr>
-              <w:lastRenderedPageBreak/>
               <w:t>שם העמודה</w:t>
             </w:r>
           </w:p>
@@ -10084,7 +10159,16 @@
                 <w:sz w:val="20"/>
                 <w:szCs w:val="20"/>
               </w:rPr>
-              <w:t>Calculated automatically (trigger)</w:t>
+              <w:t xml:space="preserve">Calculated </w:t>
+            </w:r>
+            <w:r>
+              <w:rPr>
+                <w:rFonts w:ascii="Rubik" w:hAnsi="Rubik" w:cs="Rubik"/>
+                <w:sz w:val="20"/>
+                <w:szCs w:val="20"/>
+              </w:rPr>
+              <w:lastRenderedPageBreak/>
+              <w:t>automatically (trigger)</w:t>
             </w:r>
           </w:p>
         </w:tc>
@@ -10110,7 +10194,18 @@
                 <w:szCs w:val="20"/>
                 <w:rtl/>
               </w:rPr>
-              <w:t>שווי נקי (סך נכסים פחות סך התחייבויות)</w:t>
+              <w:lastRenderedPageBreak/>
+              <w:t xml:space="preserve">שווי נקי (סך נכסים </w:t>
+            </w:r>
+            <w:r>
+              <w:rPr>
+                <w:rFonts w:ascii="Rubik" w:hAnsi="Rubik" w:cs="Rubik"/>
+                <w:sz w:val="20"/>
+                <w:szCs w:val="20"/>
+                <w:rtl/>
+              </w:rPr>
+              <w:lastRenderedPageBreak/>
+              <w:t>פחות סך התחייבויות)</w:t>
             </w:r>
           </w:p>
         </w:tc>
@@ -10958,533 +11053,217 @@
       </w:pPr>
       <w:r>
         <w:rPr>
-          <w:rFonts w:ascii="Rubik" w:hAnsi="Rubik" w:cs="Rubik" w:hint="cs"/>
           <w:noProof/>
-          <w:sz w:val="20"/>
-          <w:szCs w:val="20"/>
-          <w:rtl/>
-          <w:lang w:val="he-IL"/>
-        </w:rPr>
-        <mc:AlternateContent>
-          <mc:Choice Requires="wps">
-            <w:drawing>
-              <wp:anchor distT="0" distB="0" distL="114300" distR="114300" simplePos="0" relativeHeight="251663360" behindDoc="0" locked="0" layoutInCell="1" allowOverlap="1" wp14:anchorId="5B62CFBF" wp14:editId="656220E6">
-                <wp:simplePos x="0" y="0"/>
-                <wp:positionH relativeFrom="margin">
-                  <wp:posOffset>3822700</wp:posOffset>
-                </wp:positionH>
-                <wp:positionV relativeFrom="paragraph">
-                  <wp:posOffset>265430</wp:posOffset>
-                </wp:positionV>
-                <wp:extent cx="1485900" cy="1422400"/>
-                <wp:effectExtent l="0" t="0" r="19050" b="25400"/>
-                <wp:wrapNone/>
-                <wp:docPr id="1051529854" name="תיבת טקסט 1"/>
-                <wp:cNvGraphicFramePr/>
-                <a:graphic xmlns:a="http://schemas.openxmlformats.org/drawingml/2006/main">
-                  <a:graphicData uri="http://schemas.microsoft.com/office/word/2010/wordprocessingShape">
-                    <wps:wsp>
-                      <wps:cNvSpPr txBox="1"/>
-                      <wps:spPr>
-                        <a:xfrm>
-                          <a:off x="0" y="0"/>
-                          <a:ext cx="1485900" cy="1422400"/>
-                        </a:xfrm>
-                        <a:prstGeom prst="rect">
-                          <a:avLst/>
-                        </a:prstGeom>
-                        <a:solidFill>
-                          <a:schemeClr val="lt1"/>
-                        </a:solidFill>
-                        <a:ln w="19050">
-                          <a:solidFill>
-                            <a:prstClr val="black"/>
-                          </a:solidFill>
-                        </a:ln>
-                      </wps:spPr>
-                      <wps:txbx>
-                        <w:txbxContent>
-                          <w:p>
-                            <w:pPr>
-                              <w:jc w:val="center"/>
-                              <w:rPr>
-                                <w:rFonts w:ascii="Rubik" w:hAnsi="Rubik" w:cs="Rubik"/>
-                                <w:b/>
-                                <w:bCs/>
-                                <w:sz w:val="24"/>
-                                <w:szCs w:val="24"/>
-                              </w:rPr>
-                            </w:pPr>
-                            <w:r>
-                              <w:rPr>
-                                <w:rFonts w:ascii="Rubik" w:hAnsi="Rubik" w:cs="Rubik"/>
-                                <w:b/>
-                                <w:bCs/>
-                                <w:sz w:val="24"/>
-                                <w:szCs w:val="24"/>
-                              </w:rPr>
-                              <w:t>Businesses</w:t>
-                            </w:r>
-                          </w:p>
-                          <w:p>
-                            <w:pPr>
-                              <w:jc w:val="right"/>
-                              <w:rPr>
-                                <w:rFonts w:ascii="Rubik" w:hAnsi="Rubik" w:cs="Rubik"/>
-                                <w:sz w:val="24"/>
-                                <w:szCs w:val="24"/>
-                              </w:rPr>
-                            </w:pPr>
-                            <w:r>
-                              <w:rPr>
-                                <w:rFonts w:ascii="Rubik" w:hAnsi="Rubik" w:cs="Rubik"/>
-                                <w:sz w:val="24"/>
-                                <w:szCs w:val="24"/>
-                              </w:rPr>
-                              <w:t>Id (PK)</w:t>
-                            </w:r>
-                          </w:p>
-                          <w:p>
-                            <w:pPr>
-                              <w:jc w:val="right"/>
-                              <w:rPr>
-                                <w:rFonts w:ascii="Rubik" w:hAnsi="Rubik" w:cs="Rubik"/>
-                                <w:sz w:val="24"/>
-                                <w:szCs w:val="24"/>
-                              </w:rPr>
-                            </w:pPr>
-                            <w:r>
-                              <w:rPr>
-                                <w:rFonts w:ascii="Rubik" w:hAnsi="Rubik" w:cs="Rubik"/>
-                                <w:sz w:val="24"/>
-                                <w:szCs w:val="24"/>
-                              </w:rPr>
-                              <w:t>Name</w:t>
-                            </w:r>
-                          </w:p>
-                          <w:p>
-                            <w:pPr>
-                              <w:jc w:val="right"/>
-                              <w:rPr>
-                                <w:rFonts w:ascii="Rubik" w:hAnsi="Rubik" w:cs="Rubik"/>
-                                <w:sz w:val="24"/>
-                                <w:szCs w:val="24"/>
-                                <w:rtl/>
-                              </w:rPr>
-                            </w:pPr>
-                            <w:r>
-                              <w:rPr>
-                                <w:rFonts w:ascii="Rubik" w:hAnsi="Rubik" w:cs="Rubik"/>
-                                <w:sz w:val="24"/>
-                                <w:szCs w:val="24"/>
-                              </w:rPr>
-                              <w:t>…</w:t>
-                            </w:r>
-                            <w:r>
-                              <w:rPr>
-                                <w:rFonts w:ascii="Rubik" w:hAnsi="Rubik" w:cs="Rubik"/>
-                                <w:sz w:val="24"/>
-                                <w:szCs w:val="24"/>
-                              </w:rPr>
-                              <w:t xml:space="preserve">  </w:t>
-                            </w:r>
-                          </w:p>
-                        </w:txbxContent>
-                      </wps:txbx>
-                      <wps:bodyPr rot="0" spcFirstLastPara="0" vertOverflow="overflow" horzOverflow="overflow" vert="horz" wrap="square" lIns="91440" tIns="45720" rIns="91440" bIns="45720" numCol="1" spcCol="0" rtlCol="1" fromWordArt="0" anchor="t" anchorCtr="0" forceAA="0" compatLnSpc="1">
-                        <a:prstTxWarp prst="textNoShape">
-                          <a:avLst/>
-                        </a:prstTxWarp>
-                        <a:noAutofit/>
-                      </wps:bodyPr>
-                    </wps:wsp>
-                  </a:graphicData>
-                </a:graphic>
-                <wp14:sizeRelH relativeFrom="margin">
-                  <wp14:pctWidth>0</wp14:pctWidth>
-                </wp14:sizeRelH>
-                <wp14:sizeRelV relativeFrom="margin">
-                  <wp14:pctHeight>0</wp14:pctHeight>
-                </wp14:sizeRelV>
-              </wp:anchor>
-            </w:drawing>
-          </mc:Choice>
-          <mc:Fallback>
-            <w:pict>
-              <v:shapetype w14:anchorId="5B62CFBF" id="_x0000_t202" coordsize="21600,21600" o:spt="202" path="m,l,21600r21600,l21600,xe">
-                <v:stroke joinstyle="miter"/>
-                <v:path gradientshapeok="t" o:connecttype="rect"/>
-              </v:shapetype>
-              <v:shape id="תיבת טקסט 1" o:spid="_x0000_s1026" type="#_x0000_t202" style="position:absolute;left:0;text-align:left;margin-left:301pt;margin-top:20.9pt;width:117pt;height:112pt;z-index:251663360;visibility:visible;mso-wrap-style:square;mso-width-percent:0;mso-height-percent:0;mso-wrap-distance-left:9pt;mso-wrap-distance-top:0;mso-wrap-distance-right:9pt;mso-wrap-distance-bottom:0;mso-position-horizontal:absolute;mso-position-horizontal-relative:margin;mso-position-vertical:absolute;mso-position-vertical-relative:text;mso-width-percent:0;mso-height-percent:0;mso-width-relative:margin;mso-height-relative:margin;v-text-anchor:top" o:gfxdata="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" fillcolor="white [3201]" strokeweight="1.5pt">
-                <v:textbox>
-                  <w:txbxContent>
-                    <w:p>
-                      <w:pPr>
-                        <w:jc w:val="center"/>
-                        <w:rPr>
-                          <w:rFonts w:ascii="Rubik" w:hAnsi="Rubik" w:cs="Rubik"/>
-                          <w:b/>
-                          <w:bCs/>
-                          <w:sz w:val="24"/>
-                          <w:szCs w:val="24"/>
-                        </w:rPr>
-                      </w:pPr>
-                      <w:r>
-                        <w:rPr>
-                          <w:rFonts w:ascii="Rubik" w:hAnsi="Rubik" w:cs="Rubik"/>
-                          <w:b/>
-                          <w:bCs/>
-                          <w:sz w:val="24"/>
-                          <w:szCs w:val="24"/>
-                        </w:rPr>
-                        <w:t>Businesses</w:t>
-                      </w:r>
-                    </w:p>
-                    <w:p>
-                      <w:pPr>
-                        <w:jc w:val="right"/>
-                        <w:rPr>
-                          <w:rFonts w:ascii="Rubik" w:hAnsi="Rubik" w:cs="Rubik"/>
-                          <w:sz w:val="24"/>
-                          <w:szCs w:val="24"/>
-                        </w:rPr>
-                      </w:pPr>
-                      <w:r>
-                        <w:rPr>
-                          <w:rFonts w:ascii="Rubik" w:hAnsi="Rubik" w:cs="Rubik"/>
-                          <w:sz w:val="24"/>
-                          <w:szCs w:val="24"/>
-                        </w:rPr>
-                        <w:t>Id (PK)</w:t>
-                      </w:r>
-                    </w:p>
-                    <w:p>
-                      <w:pPr>
-                        <w:jc w:val="right"/>
-                        <w:rPr>
-                          <w:rFonts w:ascii="Rubik" w:hAnsi="Rubik" w:cs="Rubik"/>
-                          <w:sz w:val="24"/>
-                          <w:szCs w:val="24"/>
-                        </w:rPr>
-                      </w:pPr>
-                      <w:r>
-                        <w:rPr>
-                          <w:rFonts w:ascii="Rubik" w:hAnsi="Rubik" w:cs="Rubik"/>
-                          <w:sz w:val="24"/>
-                          <w:szCs w:val="24"/>
-                        </w:rPr>
-                        <w:t>Name</w:t>
-                      </w:r>
-                    </w:p>
-                    <w:p>
-                      <w:pPr>
-                        <w:jc w:val="right"/>
-                        <w:rPr>
-                          <w:rFonts w:ascii="Rubik" w:hAnsi="Rubik" w:cs="Rubik"/>
-                          <w:sz w:val="24"/>
-                          <w:szCs w:val="24"/>
-                          <w:rtl/>
-                        </w:rPr>
-                      </w:pPr>
-                      <w:r>
-                        <w:rPr>
-                          <w:rFonts w:ascii="Rubik" w:hAnsi="Rubik" w:cs="Rubik"/>
-                          <w:sz w:val="24"/>
-                          <w:szCs w:val="24"/>
-                        </w:rPr>
-                        <w:t>…</w:t>
-                      </w:r>
-                      <w:r>
-                        <w:rPr>
-                          <w:rFonts w:ascii="Rubik" w:hAnsi="Rubik" w:cs="Rubik"/>
-                          <w:sz w:val="24"/>
-                          <w:szCs w:val="24"/>
-                        </w:rPr>
-                        <w:t xml:space="preserve">  </w:t>
-                      </w:r>
-                    </w:p>
-                  </w:txbxContent>
-                </v:textbox>
-                <w10:wrap anchorx="margin"/>
-              </v:shape>
-            </w:pict>
-          </mc:Fallback>
-        </mc:AlternateContent>
-      </w:r>
-      <w:r>
-        <w:rPr>
-          <w:rFonts w:ascii="Rubik" w:hAnsi="Rubik" w:cs="Rubik" w:hint="cs"/>
+        </w:rPr>
+        <w:pict w14:anchorId="734A3B8A">
+          <v:shapetype id="_x0000_t202" coordsize="21600,21600" o:spt="202" path="m,l,21600r21600,l21600,xe">
+            <v:stroke joinstyle="miter"/>
+            <v:path gradientshapeok="t" o:connecttype="rect"/>
+          </v:shapetype>
+          <v:shape id="תיבת טקסט 1" o:spid="_x0000_s2055" type="#_x0000_t202" style="position:absolute;left:0;text-align:left;margin-left:301pt;margin-top:20.9pt;width:117pt;height:112pt;z-index:251663360;visibility:visible;mso-wrap-style:square;mso-width-percent:0;mso-height-percent:0;mso-wrap-distance-left:9pt;mso-wrap-distance-top:0;mso-wrap-distance-right:9pt;mso-wrap-distance-bottom:0;mso-position-horizontal:absolute;mso-position-horizontal-relative:margin;mso-position-vertical:absolute;mso-position-vertical-relative:text;mso-width-percent:0;mso-height-percent:0;mso-width-relative:margin;mso-height-relative:margin;v-text-anchor:top" o:gfxdata="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" fillcolor="white [3201]" strokeweight="1.5pt">
+            <v:textbox>
+              <w:txbxContent>
+                <w:p>
+                  <w:pPr>
+                    <w:jc w:val="center"/>
+                    <w:rPr>
+                      <w:rFonts w:ascii="Rubik" w:hAnsi="Rubik" w:cs="Rubik"/>
+                      <w:b/>
+                      <w:bCs/>
+                      <w:sz w:val="24"/>
+                      <w:szCs w:val="24"/>
+                    </w:rPr>
+                  </w:pPr>
+                  <w:r>
+                    <w:rPr>
+                      <w:rFonts w:ascii="Rubik" w:hAnsi="Rubik" w:cs="Rubik"/>
+                      <w:b/>
+                      <w:bCs/>
+                      <w:sz w:val="24"/>
+                      <w:szCs w:val="24"/>
+                    </w:rPr>
+                    <w:t>Businesses</w:t>
+                  </w:r>
+                </w:p>
+                <w:p>
+                  <w:pPr>
+                    <w:jc w:val="right"/>
+                    <w:rPr>
+                      <w:rFonts w:ascii="Rubik" w:hAnsi="Rubik" w:cs="Rubik"/>
+                      <w:sz w:val="24"/>
+                      <w:szCs w:val="24"/>
+                    </w:rPr>
+                  </w:pPr>
+                  <w:r>
+                    <w:rPr>
+                      <w:rFonts w:ascii="Rubik" w:hAnsi="Rubik" w:cs="Rubik"/>
+                      <w:sz w:val="24"/>
+                      <w:szCs w:val="24"/>
+                    </w:rPr>
+                    <w:t>Id (PK)</w:t>
+                  </w:r>
+                </w:p>
+                <w:p>
+                  <w:pPr>
+                    <w:jc w:val="right"/>
+                    <w:rPr>
+                      <w:rFonts w:ascii="Rubik" w:hAnsi="Rubik" w:cs="Rubik"/>
+                      <w:sz w:val="24"/>
+                      <w:szCs w:val="24"/>
+                    </w:rPr>
+                  </w:pPr>
+                  <w:r>
+                    <w:rPr>
+                      <w:rFonts w:ascii="Rubik" w:hAnsi="Rubik" w:cs="Rubik"/>
+                      <w:sz w:val="24"/>
+                      <w:szCs w:val="24"/>
+                    </w:rPr>
+                    <w:t>Name</w:t>
+                  </w:r>
+                </w:p>
+                <w:p>
+                  <w:pPr>
+                    <w:jc w:val="right"/>
+                    <w:rPr>
+                      <w:rFonts w:ascii="Rubik" w:hAnsi="Rubik" w:cs="Rubik"/>
+                      <w:sz w:val="24"/>
+                      <w:szCs w:val="24"/>
+                      <w:rtl/>
+                    </w:rPr>
+                  </w:pPr>
+                  <w:r>
+                    <w:rPr>
+                      <w:rFonts w:ascii="Rubik" w:hAnsi="Rubik" w:cs="Rubik"/>
+                      <w:sz w:val="24"/>
+                      <w:szCs w:val="24"/>
+                    </w:rPr>
+                    <w:t>…</w:t>
+                  </w:r>
+                  <w:r>
+                    <w:rPr>
+                      <w:rFonts w:ascii="Rubik" w:hAnsi="Rubik" w:cs="Rubik"/>
+                      <w:sz w:val="24"/>
+                      <w:szCs w:val="24"/>
+                    </w:rPr>
+                    <w:t xml:space="preserve">  </w:t>
+                  </w:r>
+                </w:p>
+              </w:txbxContent>
+            </v:textbox>
+            <w10:wrap anchorx="margin"/>
+          </v:shape>
+        </w:pict>
+      </w:r>
+      <w:r>
+        <w:rPr>
           <w:noProof/>
-          <w:sz w:val="20"/>
-          <w:szCs w:val="20"/>
-          <w:rtl/>
-          <w:lang w:val="he-IL"/>
-        </w:rPr>
-        <mc:AlternateContent>
-          <mc:Choice Requires="wps">
-            <w:drawing>
-              <wp:anchor distT="0" distB="0" distL="114300" distR="114300" simplePos="0" relativeHeight="251659264" behindDoc="0" locked="0" layoutInCell="1" allowOverlap="1" wp14:anchorId="74E3BC2A" wp14:editId="1E93FD70">
-                <wp:simplePos x="0" y="0"/>
-                <wp:positionH relativeFrom="margin">
-                  <wp:align>left</wp:align>
-                </wp:positionH>
-                <wp:positionV relativeFrom="paragraph">
-                  <wp:posOffset>241753</wp:posOffset>
-                </wp:positionV>
-                <wp:extent cx="1512570" cy="1463675"/>
-                <wp:effectExtent l="0" t="0" r="11430" b="22225"/>
-                <wp:wrapNone/>
-                <wp:docPr id="462933301" name="תיבת טקסט 2"/>
-                <wp:cNvGraphicFramePr/>
-                <a:graphic xmlns:a="http://schemas.openxmlformats.org/drawingml/2006/main">
-                  <a:graphicData uri="http://schemas.microsoft.com/office/word/2010/wordprocessingShape">
-                    <wps:wsp>
-                      <wps:cNvSpPr txBox="1"/>
-                      <wps:spPr>
-                        <a:xfrm>
-                          <a:off x="0" y="0"/>
-                          <a:ext cx="1512570" cy="1463675"/>
-                        </a:xfrm>
-                        <a:prstGeom prst="rect">
-                          <a:avLst/>
-                        </a:prstGeom>
-                        <a:solidFill>
-                          <a:schemeClr val="lt1"/>
-                        </a:solidFill>
-                        <a:ln w="19050">
-                          <a:solidFill>
-                            <a:prstClr val="black"/>
-                          </a:solidFill>
-                        </a:ln>
-                      </wps:spPr>
-                      <wps:txbx>
-                        <w:txbxContent>
-                          <w:p>
-                            <w:pPr>
-                              <w:jc w:val="center"/>
-                              <w:rPr>
-                                <w:rFonts w:ascii="Rubik" w:hAnsi="Rubik" w:cs="Rubik"/>
-                                <w:b/>
-                                <w:bCs/>
-                                <w:sz w:val="24"/>
-                                <w:szCs w:val="24"/>
-                              </w:rPr>
-                            </w:pPr>
-                            <w:r>
-                              <w:rPr>
-                                <w:rFonts w:ascii="Rubik" w:hAnsi="Rubik" w:cs="Rubik"/>
-                                <w:b/>
-                                <w:bCs/>
-                                <w:sz w:val="24"/>
-                                <w:szCs w:val="24"/>
-                              </w:rPr>
-                              <w:t>Invoices</w:t>
-                            </w:r>
-                          </w:p>
-                          <w:p>
-                            <w:pPr>
-                              <w:jc w:val="right"/>
-                              <w:rPr>
-                                <w:rFonts w:ascii="Rubik" w:hAnsi="Rubik" w:cs="Rubik"/>
-                                <w:sz w:val="24"/>
-                                <w:szCs w:val="24"/>
-                              </w:rPr>
-                            </w:pPr>
-                            <w:r>
-                              <w:rPr>
-                                <w:rFonts w:ascii="Rubik" w:hAnsi="Rubik" w:cs="Rubik"/>
-                                <w:sz w:val="24"/>
-                                <w:szCs w:val="24"/>
-                              </w:rPr>
-                              <w:t>Id (PK)</w:t>
-                            </w:r>
-                          </w:p>
-                          <w:p>
-                            <w:pPr>
-                              <w:jc w:val="right"/>
-                              <w:rPr>
-                                <w:rFonts w:ascii="Rubik" w:hAnsi="Rubik" w:cs="Rubik"/>
-                                <w:sz w:val="24"/>
-                                <w:szCs w:val="24"/>
-                                <w:rtl/>
-                              </w:rPr>
-                            </w:pPr>
-                            <w:r>
-                              <w:rPr>
-                                <w:rFonts w:ascii="Rubik" w:hAnsi="Rubik" w:cs="Rubik"/>
-                                <w:sz w:val="24"/>
-                                <w:szCs w:val="24"/>
-                              </w:rPr>
-                              <w:t>user_id (FK)</w:t>
-                            </w:r>
-                          </w:p>
-                          <w:p>
-                            <w:pPr>
-                              <w:jc w:val="right"/>
-                              <w:rPr>
-                                <w:rFonts w:ascii="Rubik" w:hAnsi="Rubik" w:cs="Rubik"/>
-                                <w:sz w:val="24"/>
-                                <w:szCs w:val="24"/>
-                              </w:rPr>
-                            </w:pPr>
-                            <w:r>
-                              <w:rPr>
-                                <w:rFonts w:ascii="Rubik" w:hAnsi="Rubik" w:cs="Rubik"/>
-                                <w:sz w:val="24"/>
-                                <w:szCs w:val="24"/>
-                              </w:rPr>
-                              <w:t>business_id</w:t>
-                            </w:r>
-                          </w:p>
-                          <w:p>
-                            <w:pPr>
-                              <w:jc w:val="right"/>
-                              <w:rPr>
-                                <w:rFonts w:ascii="Rubik" w:hAnsi="Rubik" w:cs="Rubik"/>
-                                <w:sz w:val="24"/>
-                                <w:szCs w:val="24"/>
-                                <w:rtl/>
-                              </w:rPr>
-                            </w:pPr>
-                            <w:r>
-                              <w:rPr>
-                                <w:rFonts w:ascii="Rubik" w:hAnsi="Rubik" w:cs="Rubik" w:hint="cs"/>
-                                <w:sz w:val="24"/>
-                                <w:szCs w:val="24"/>
-                                <w:rtl/>
-                              </w:rPr>
-                              <w:t>...</w:t>
-                            </w:r>
-                          </w:p>
-                        </w:txbxContent>
-                      </wps:txbx>
-                      <wps:bodyPr rot="0" spcFirstLastPara="0" vertOverflow="overflow" horzOverflow="overflow" vert="horz" wrap="square" lIns="91440" tIns="45720" rIns="91440" bIns="45720" numCol="1" spcCol="0" rtlCol="1" fromWordArt="0" anchor="t" anchorCtr="0" forceAA="0" compatLnSpc="1">
-                        <a:prstTxWarp prst="textNoShape">
-                          <a:avLst/>
-                        </a:prstTxWarp>
-                        <a:noAutofit/>
-                      </wps:bodyPr>
-                    </wps:wsp>
-                  </a:graphicData>
-                </a:graphic>
-                <wp14:sizeRelH relativeFrom="margin">
-                  <wp14:pctWidth>0</wp14:pctWidth>
-                </wp14:sizeRelH>
-                <wp14:sizeRelV relativeFrom="margin">
-                  <wp14:pctHeight>0</wp14:pctHeight>
-                </wp14:sizeRelV>
-              </wp:anchor>
-            </w:drawing>
-          </mc:Choice>
-          <mc:Fallback>
-            <w:pict>
-              <v:shape w14:anchorId="74E3BC2A" id="תיבת טקסט 2" o:spid="_x0000_s1027" type="#_x0000_t202" style="position:absolute;left:0;text-align:left;margin-left:0;margin-top:19.05pt;width:119.1pt;height:115.25pt;z-index:251659264;visibility:visible;mso-wrap-style:square;mso-width-percent:0;mso-height-percent:0;mso-wrap-distance-left:9pt;mso-wrap-distance-top:0;mso-wrap-distance-right:9pt;mso-wrap-distance-bottom:0;mso-position-horizontal:left;mso-position-horizontal-relative:margin;mso-position-vertical:absolute;mso-position-vertical-relative:text;mso-width-percent:0;mso-height-percent:0;mso-width-relative:margin;mso-height-relative:margin;v-text-anchor:top" o:gfxdata="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" fillcolor="white [3201]" strokeweight="1.5pt">
-                <v:textbox>
-                  <w:txbxContent>
-                    <w:p>
-                      <w:pPr>
-                        <w:jc w:val="center"/>
-                        <w:rPr>
-                          <w:rFonts w:ascii="Rubik" w:hAnsi="Rubik" w:cs="Rubik"/>
-                          <w:b/>
-                          <w:bCs/>
-                          <w:sz w:val="24"/>
-                          <w:szCs w:val="24"/>
-                        </w:rPr>
-                      </w:pPr>
-                      <w:r>
-                        <w:rPr>
-                          <w:rFonts w:ascii="Rubik" w:hAnsi="Rubik" w:cs="Rubik"/>
-                          <w:b/>
-                          <w:bCs/>
-                          <w:sz w:val="24"/>
-                          <w:szCs w:val="24"/>
-                        </w:rPr>
-                        <w:t>Invoices</w:t>
-                      </w:r>
-                    </w:p>
-                    <w:p>
-                      <w:pPr>
-                        <w:jc w:val="right"/>
-                        <w:rPr>
-                          <w:rFonts w:ascii="Rubik" w:hAnsi="Rubik" w:cs="Rubik"/>
-                          <w:sz w:val="24"/>
-                          <w:szCs w:val="24"/>
-                        </w:rPr>
-                      </w:pPr>
-                      <w:r>
-                        <w:rPr>
-                          <w:rFonts w:ascii="Rubik" w:hAnsi="Rubik" w:cs="Rubik"/>
-                          <w:sz w:val="24"/>
-                          <w:szCs w:val="24"/>
-                        </w:rPr>
-                        <w:t>Id (PK)</w:t>
-                      </w:r>
-                    </w:p>
-                    <w:p>
-                      <w:pPr>
-                        <w:jc w:val="right"/>
-                        <w:rPr>
-                          <w:rFonts w:ascii="Rubik" w:hAnsi="Rubik" w:cs="Rubik"/>
-                          <w:sz w:val="24"/>
-                          <w:szCs w:val="24"/>
-                          <w:rtl/>
-                        </w:rPr>
-                      </w:pPr>
-                      <w:r>
-                        <w:rPr>
-                          <w:rFonts w:ascii="Rubik" w:hAnsi="Rubik" w:cs="Rubik"/>
-                          <w:sz w:val="24"/>
-                          <w:szCs w:val="24"/>
-                        </w:rPr>
-                        <w:t>user_id (FK)</w:t>
-                      </w:r>
-                    </w:p>
-                    <w:p>
-                      <w:pPr>
-                        <w:jc w:val="right"/>
-                        <w:rPr>
-                          <w:rFonts w:ascii="Rubik" w:hAnsi="Rubik" w:cs="Rubik"/>
-                          <w:sz w:val="24"/>
-                          <w:szCs w:val="24"/>
-                        </w:rPr>
-                      </w:pPr>
-                      <w:r>
-                        <w:rPr>
-                          <w:rFonts w:ascii="Rubik" w:hAnsi="Rubik" w:cs="Rubik"/>
-                          <w:sz w:val="24"/>
-                          <w:szCs w:val="24"/>
-                        </w:rPr>
-                        <w:t>business_id</w:t>
-                      </w:r>
-                    </w:p>
-                    <w:p>
-                      <w:pPr>
-                        <w:jc w:val="right"/>
-                        <w:rPr>
-                          <w:rFonts w:ascii="Rubik" w:hAnsi="Rubik" w:cs="Rubik"/>
-                          <w:sz w:val="24"/>
-                          <w:szCs w:val="24"/>
-                          <w:rtl/>
-                        </w:rPr>
-                      </w:pPr>
-                      <w:r>
-                        <w:rPr>
-                          <w:rFonts w:ascii="Rubik" w:hAnsi="Rubik" w:cs="Rubik" w:hint="cs"/>
-                          <w:sz w:val="24"/>
-                          <w:szCs w:val="24"/>
-                          <w:rtl/>
-                        </w:rPr>
-                        <w:t>...</w:t>
-                      </w:r>
-                    </w:p>
-                  </w:txbxContent>
-                </v:textbox>
-                <w10:wrap anchorx="margin"/>
-              </v:shape>
-            </w:pict>
-          </mc:Fallback>
-        </mc:AlternateContent>
+        </w:rPr>
+        <w:pict w14:anchorId="46A0DED0">
+          <v:shape id="תיבת טקסט 2" o:spid="_x0000_s2054" type="#_x0000_t202" style="position:absolute;left:0;text-align:left;margin-left:0;margin-top:19.05pt;width:119.1pt;height:115.25pt;z-index:251659264;visibility:visible;mso-wrap-style:square;mso-width-percent:0;mso-height-percent:0;mso-wrap-distance-left:9pt;mso-wrap-distance-top:0;mso-wrap-distance-right:9pt;mso-wrap-distance-bottom:0;mso-position-horizontal:left;mso-position-horizontal-relative:margin;mso-position-vertical:absolute;mso-position-vertical-relative:text;mso-width-percent:0;mso-height-percent:0;mso-width-relative:margin;mso-height-relative:margin;v-text-anchor:top" o:gfxdata="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" fillcolor="white [3201]" strokeweight="1.5pt">
+            <v:textbox>
+              <w:txbxContent>
+                <w:p>
+                  <w:pPr>
+                    <w:jc w:val="center"/>
+                    <w:rPr>
+                      <w:rFonts w:ascii="Rubik" w:hAnsi="Rubik" w:cs="Rubik"/>
+                      <w:b/>
+                      <w:bCs/>
+                      <w:sz w:val="24"/>
+                      <w:szCs w:val="24"/>
+                    </w:rPr>
+                  </w:pPr>
+                  <w:r>
+                    <w:rPr>
+                      <w:rFonts w:ascii="Rubik" w:hAnsi="Rubik" w:cs="Rubik"/>
+                      <w:b/>
+                      <w:bCs/>
+                      <w:sz w:val="24"/>
+                      <w:szCs w:val="24"/>
+                    </w:rPr>
+                    <w:t>Invoices</w:t>
+                  </w:r>
+                </w:p>
+                <w:p>
+                  <w:pPr>
+                    <w:jc w:val="right"/>
+                    <w:rPr>
+                      <w:rFonts w:ascii="Rubik" w:hAnsi="Rubik" w:cs="Rubik"/>
+                      <w:sz w:val="24"/>
+                      <w:szCs w:val="24"/>
+                    </w:rPr>
+                  </w:pPr>
+                  <w:r>
+                    <w:rPr>
+                      <w:rFonts w:ascii="Rubik" w:hAnsi="Rubik" w:cs="Rubik"/>
+                      <w:sz w:val="24"/>
+                      <w:szCs w:val="24"/>
+                    </w:rPr>
+                    <w:t>Id (PK)</w:t>
+                  </w:r>
+                </w:p>
+                <w:p>
+                  <w:pPr>
+                    <w:jc w:val="right"/>
+                    <w:rPr>
+                      <w:rFonts w:ascii="Rubik" w:hAnsi="Rubik" w:cs="Rubik"/>
+                      <w:sz w:val="24"/>
+                      <w:szCs w:val="24"/>
+                      <w:rtl/>
+                    </w:rPr>
+                  </w:pPr>
+                  <w:r>
+                    <w:rPr>
+                      <w:rFonts w:ascii="Rubik" w:hAnsi="Rubik" w:cs="Rubik"/>
+                      <w:sz w:val="24"/>
+                      <w:szCs w:val="24"/>
+                    </w:rPr>
+                    <w:t>user_id (FK)</w:t>
+                  </w:r>
+                </w:p>
+                <w:p>
+                  <w:pPr>
+                    <w:jc w:val="right"/>
+                    <w:rPr>
+                      <w:rFonts w:ascii="Rubik" w:hAnsi="Rubik" w:cs="Rubik"/>
+                      <w:sz w:val="24"/>
+                      <w:szCs w:val="24"/>
+                    </w:rPr>
+                  </w:pPr>
+                  <w:r>
+                    <w:rPr>
+                      <w:rFonts w:ascii="Rubik" w:hAnsi="Rubik" w:cs="Rubik"/>
+                      <w:sz w:val="24"/>
+                      <w:szCs w:val="24"/>
+                    </w:rPr>
+                    <w:t>business_id</w:t>
+                  </w:r>
+                </w:p>
+                <w:p>
+                  <w:pPr>
+                    <w:jc w:val="right"/>
+                    <w:rPr>
+                      <w:rFonts w:ascii="Rubik" w:hAnsi="Rubik" w:cs="Rubik"/>
+                      <w:sz w:val="24"/>
+                      <w:szCs w:val="24"/>
+                      <w:rtl/>
+                    </w:rPr>
+                  </w:pPr>
+                  <w:r>
+                    <w:rPr>
+                      <w:rFonts w:ascii="Rubik" w:hAnsi="Rubik" w:cs="Rubik" w:hint="cs"/>
+                      <w:sz w:val="24"/>
+                      <w:szCs w:val="24"/>
+                      <w:rtl/>
+                    </w:rPr>
+                    <w:t>...</w:t>
+                  </w:r>
+                </w:p>
+              </w:txbxContent>
+            </v:textbox>
+            <w10:wrap anchorx="margin"/>
+          </v:shape>
+        </w:pict>
       </w:r>
     </w:p>
     <w:p>
@@ -11518,180 +11297,36 @@
       </w:pPr>
       <w:r>
         <w:rPr>
-          <w:rFonts w:ascii="Rubik" w:hAnsi="Rubik" w:cs="Rubik" w:hint="cs"/>
           <w:noProof/>
-          <w:sz w:val="20"/>
-          <w:szCs w:val="20"/>
-          <w:rtl/>
-          <w:lang w:val="he-IL"/>
-        </w:rPr>
-        <mc:AlternateContent>
-          <mc:Choice Requires="wps">
-            <w:drawing>
-              <wp:anchor distT="0" distB="0" distL="114300" distR="114300" simplePos="0" relativeHeight="251668480" behindDoc="0" locked="0" layoutInCell="1" allowOverlap="1" wp14:anchorId="280C313D" wp14:editId="65E1F4E4">
-                <wp:simplePos x="0" y="0"/>
-                <wp:positionH relativeFrom="margin">
-                  <wp:posOffset>1485899</wp:posOffset>
-                </wp:positionH>
-                <wp:positionV relativeFrom="paragraph">
-                  <wp:posOffset>32656</wp:posOffset>
-                </wp:positionV>
-                <wp:extent cx="2323465" cy="493214"/>
-                <wp:effectExtent l="38100" t="19050" r="635" b="97790"/>
-                <wp:wrapNone/>
-                <wp:docPr id="633503556" name="מחבר: מעוקל 3"/>
-                <wp:cNvGraphicFramePr/>
-                <a:graphic xmlns:a="http://schemas.openxmlformats.org/drawingml/2006/main">
-                  <a:graphicData uri="http://schemas.microsoft.com/office/word/2010/wordprocessingShape">
-                    <wps:wsp>
-                      <wps:cNvCnPr/>
-                      <wps:spPr>
-                        <a:xfrm flipH="1">
-                          <a:off x="0" y="0"/>
-                          <a:ext cx="2323465" cy="493214"/>
-                        </a:xfrm>
-                        <a:prstGeom prst="curvedConnector3">
-                          <a:avLst>
-                            <a:gd name="adj1" fmla="val 54038"/>
-                          </a:avLst>
-                        </a:prstGeom>
-                        <a:ln w="38100">
-                          <a:solidFill>
-                            <a:srgbClr val="00B0F0"/>
-                          </a:solidFill>
-                          <a:tailEnd type="triangle"/>
-                        </a:ln>
-                      </wps:spPr>
-                      <wps:style>
-                        <a:lnRef idx="1">
-                          <a:schemeClr val="accent1"/>
-                        </a:lnRef>
-                        <a:fillRef idx="0">
-                          <a:schemeClr val="accent1"/>
-                        </a:fillRef>
-                        <a:effectRef idx="0">
-                          <a:schemeClr val="accent1"/>
-                        </a:effectRef>
-                        <a:fontRef idx="minor">
-                          <a:schemeClr val="tx1"/>
-                        </a:fontRef>
-                      </wps:style>
-                      <wps:bodyPr/>
-                    </wps:wsp>
-                  </a:graphicData>
-                </a:graphic>
-                <wp14:sizeRelH relativeFrom="margin">
-                  <wp14:pctWidth>0</wp14:pctWidth>
-                </wp14:sizeRelH>
-                <wp14:sizeRelV relativeFrom="margin">
-                  <wp14:pctHeight>0</wp14:pctHeight>
-                </wp14:sizeRelV>
-              </wp:anchor>
-            </w:drawing>
-          </mc:Choice>
-          <mc:Fallback>
-            <w:pict>
-              <v:shapetype w14:anchorId="4EABEC96" id="_x0000_t38" coordsize="21600,21600" o:spt="38" o:oned="t" path="m,c@0,0@1,5400@1,10800@1,16200@2,21600,21600,21600e" filled="f">
-                <v:formulas>
-                  <v:f eqn="mid #0 0"/>
-                  <v:f eqn="val #0"/>
-                  <v:f eqn="mid #0 21600"/>
-                </v:formulas>
-                <v:path arrowok="t" fillok="f" o:connecttype="none"/>
-                <v:handles>
-                  <v:h position="#0,center"/>
-                </v:handles>
-                <o:lock v:ext="edit" shapetype="t"/>
-              </v:shapetype>
-              <v:shape id="מחבר: מעוקל 1" o:spid="_x0000_s1026" type="#_x0000_t38" style="position:absolute;left:0;text-align:left;margin-left:117pt;margin-top:2.55pt;width:182.95pt;height:38.85pt;flip:x;z-index:251668480;visibility:visible;mso-wrap-style:square;mso-width-percent:0;mso-height-percent:0;mso-wrap-distance-left:9pt;mso-wrap-distance-top:0;mso-wrap-distance-right:9pt;mso-wrap-distance-bottom:0;mso-position-horizontal:absolute;mso-position-horizontal-relative:margin;mso-position-vertical:absolute;mso-position-vertical-relative:text;mso-width-percent:0;mso-height-percent:0;mso-width-relative:margin;mso-height-relative:margin" o:gfxdata="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" adj="11672" strokecolor="#00b0f0" strokeweight="3pt">
-                <v:stroke endarrow="block" joinstyle="miter"/>
-                <w10:wrap anchorx="margin"/>
-              </v:shape>
-            </w:pict>
-          </mc:Fallback>
-        </mc:AlternateContent>
-      </w:r>
-      <w:r>
-        <w:rPr>
-          <w:rFonts w:ascii="Rubik" w:hAnsi="Rubik" w:cs="Rubik" w:hint="cs"/>
+        </w:rPr>
+        <w:pict w14:anchorId="2F622D47">
+          <v:shapetype id="_x0000_t38" coordsize="21600,21600" o:spt="38" o:oned="t" path="m,c@0,0@1,5400@1,10800@1,16200@2,21600,21600,21600e" filled="f">
+            <v:formulas>
+              <v:f eqn="mid #0 0"/>
+              <v:f eqn="val #0"/>
+              <v:f eqn="mid #0 21600"/>
+            </v:formulas>
+            <v:path arrowok="t" fillok="f" o:connecttype="none"/>
+            <v:handles>
+              <v:h position="#0,center"/>
+            </v:handles>
+            <o:lock v:ext="edit" shapetype="t"/>
+          </v:shapetype>
+          <v:shape id="מחבר: מעוקל 3" o:spid="_x0000_s2053" type="#_x0000_t38" style="position:absolute;left:0;text-align:left;margin-left:117pt;margin-top:2.55pt;width:182.95pt;height:38.85pt;flip:x;z-index:251668480;visibility:visible;mso-wrap-style:square;mso-width-percent:0;mso-height-percent:0;mso-wrap-distance-left:9pt;mso-wrap-distance-top:0;mso-wrap-distance-right:9pt;mso-wrap-distance-bottom:0;mso-position-horizontal:absolute;mso-position-horizontal-relative:margin;mso-position-vertical:absolute;mso-position-vertical-relative:text;mso-width-percent:0;mso-height-percent:0;mso-width-relative:margin;mso-height-relative:margin" o:gfxdata="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" adj="11672" strokecolor="#00b0f0" strokeweight="3pt">
+            <v:stroke endarrow="block" joinstyle="miter"/>
+            <w10:wrap anchorx="margin"/>
+          </v:shape>
+        </w:pict>
+      </w:r>
+      <w:r>
+        <w:rPr>
           <w:noProof/>
-          <w:sz w:val="20"/>
-          <w:szCs w:val="20"/>
-          <w:rtl/>
-          <w:lang w:val="he-IL"/>
-        </w:rPr>
-        <mc:AlternateContent>
-          <mc:Choice Requires="wps">
-            <w:drawing>
-              <wp:anchor distT="0" distB="0" distL="114300" distR="114300" simplePos="0" relativeHeight="251666432" behindDoc="0" locked="0" layoutInCell="1" allowOverlap="1" wp14:anchorId="3FD4B9EB" wp14:editId="3EBFF9E1">
-                <wp:simplePos x="0" y="0"/>
-                <wp:positionH relativeFrom="column">
-                  <wp:posOffset>3488690</wp:posOffset>
-                </wp:positionH>
-                <wp:positionV relativeFrom="paragraph">
-                  <wp:posOffset>27305</wp:posOffset>
-                </wp:positionV>
-                <wp:extent cx="331470" cy="1939925"/>
-                <wp:effectExtent l="38100" t="19050" r="11430" b="41275"/>
-                <wp:wrapNone/>
-                <wp:docPr id="1498736477" name="מחבר: מעוקל 4"/>
-                <wp:cNvGraphicFramePr/>
-                <a:graphic xmlns:a="http://schemas.openxmlformats.org/drawingml/2006/main">
-                  <a:graphicData uri="http://schemas.microsoft.com/office/word/2010/wordprocessingShape">
-                    <wps:wsp>
-                      <wps:cNvCnPr/>
-                      <wps:spPr>
-                        <a:xfrm flipH="1">
-                          <a:off x="0" y="0"/>
-                          <a:ext cx="331470" cy="1939925"/>
-                        </a:xfrm>
-                        <a:prstGeom prst="curvedConnector3">
-                          <a:avLst>
-                            <a:gd name="adj1" fmla="val 45473"/>
-                          </a:avLst>
-                        </a:prstGeom>
-                        <a:ln w="38100">
-                          <a:solidFill>
-                            <a:srgbClr val="00B0F0"/>
-                          </a:solidFill>
-                          <a:tailEnd type="triangle"/>
-                        </a:ln>
-                      </wps:spPr>
-                      <wps:style>
-                        <a:lnRef idx="1">
-                          <a:schemeClr val="accent1"/>
-                        </a:lnRef>
-                        <a:fillRef idx="0">
-                          <a:schemeClr val="accent1"/>
-                        </a:fillRef>
-                        <a:effectRef idx="0">
-                          <a:schemeClr val="accent1"/>
-                        </a:effectRef>
-                        <a:fontRef idx="minor">
-                          <a:schemeClr val="tx1"/>
-                        </a:fontRef>
-                      </wps:style>
-                      <wps:bodyPr/>
-                    </wps:wsp>
-                  </a:graphicData>
-                </a:graphic>
-                <wp14:sizeRelH relativeFrom="margin">
-                  <wp14:pctWidth>0</wp14:pctWidth>
-                </wp14:sizeRelH>
-                <wp14:sizeRelV relativeFrom="margin">
-                  <wp14:pctHeight>0</wp14:pctHeight>
-                </wp14:sizeRelV>
-              </wp:anchor>
-            </w:drawing>
-          </mc:Choice>
-          <mc:Fallback>
-            <w:pict>
-              <v:shape w14:anchorId="726E5E9D" id="מחבר: מעוקל 1" o:spid="_x0000_s1026" type="#_x0000_t38" style="position:absolute;left:0;text-align:left;margin-left:274.7pt;margin-top:2.15pt;width:26.1pt;height:152.75pt;flip:x;z-index:251666432;visibility:visible;mso-wrap-style:square;mso-width-percent:0;mso-height-percent:0;mso-wrap-distance-left:9pt;mso-wrap-distance-top:0;mso-wrap-distance-right:9pt;mso-wrap-distance-bottom:0;mso-position-horizontal:absolute;mso-position-horizontal-relative:text;mso-position-vertical:absolute;mso-position-vertical-relative:text;mso-width-percent:0;mso-height-percent:0;mso-width-relative:margin;mso-height-relative:margin" o:gfxdata="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" adj="9822" strokecolor="#00b0f0" strokeweight="3pt">
-                <v:stroke endarrow="block" joinstyle="miter"/>
-              </v:shape>
-            </w:pict>
-          </mc:Fallback>
-        </mc:AlternateContent>
+        </w:rPr>
+        <w:pict w14:anchorId="39680676">
+          <v:shape id="מחבר: מעוקל 4" o:spid="_x0000_s2052" type="#_x0000_t38" style="position:absolute;left:0;text-align:left;margin-left:274.7pt;margin-top:2.15pt;width:26.1pt;height:152.75pt;flip:x;z-index:251666432;visibility:visible;mso-wrap-style:square;mso-width-percent:0;mso-height-percent:0;mso-wrap-distance-left:9pt;mso-wrap-distance-top:0;mso-wrap-distance-right:9pt;mso-wrap-distance-bottom:0;mso-position-horizontal:absolute;mso-position-horizontal-relative:text;mso-position-vertical:absolute;mso-position-vertical-relative:text;mso-width-percent:0;mso-height-percent:0;mso-width-relative:margin;mso-height-relative:margin" o:gfxdata="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" adj="9822" strokecolor="#00b0f0" strokeweight="3pt">
+            <v:stroke endarrow="block" joinstyle="miter"/>
+          </v:shape>
+        </w:pict>
       </w:r>
     </w:p>
     <w:p>
@@ -11705,85 +11340,13 @@
       </w:pPr>
       <w:r>
         <w:rPr>
-          <w:rFonts w:ascii="Rubik" w:hAnsi="Rubik" w:cs="Rubik" w:hint="cs"/>
           <w:noProof/>
-          <w:sz w:val="20"/>
-          <w:szCs w:val="20"/>
-          <w:rtl/>
-          <w:lang w:val="he-IL"/>
-        </w:rPr>
-        <mc:AlternateContent>
-          <mc:Choice Requires="wps">
-            <w:drawing>
-              <wp:anchor distT="0" distB="0" distL="114300" distR="114300" simplePos="0" relativeHeight="251664384" behindDoc="0" locked="0" layoutInCell="1" allowOverlap="1" wp14:anchorId="133844A0" wp14:editId="703F6442">
-                <wp:simplePos x="0" y="0"/>
-                <wp:positionH relativeFrom="column">
-                  <wp:posOffset>-16330</wp:posOffset>
-                </wp:positionH>
-                <wp:positionV relativeFrom="paragraph">
-                  <wp:posOffset>207281</wp:posOffset>
-                </wp:positionV>
-                <wp:extent cx="2030186" cy="1469572"/>
-                <wp:effectExtent l="285750" t="38100" r="8255" b="35560"/>
-                <wp:wrapNone/>
-                <wp:docPr id="1460097364" name="מחבר: מעוקל 5"/>
-                <wp:cNvGraphicFramePr/>
-                <a:graphic xmlns:a="http://schemas.openxmlformats.org/drawingml/2006/main">
-                  <a:graphicData uri="http://schemas.microsoft.com/office/word/2010/wordprocessingShape">
-                    <wps:wsp>
-                      <wps:cNvCnPr/>
-                      <wps:spPr>
-                        <a:xfrm flipH="1" flipV="1">
-                          <a:off x="0" y="0"/>
-                          <a:ext cx="2030186" cy="1469572"/>
-                        </a:xfrm>
-                        <a:prstGeom prst="curvedConnector3">
-                          <a:avLst>
-                            <a:gd name="adj1" fmla="val 112473"/>
-                          </a:avLst>
-                        </a:prstGeom>
-                        <a:ln w="38100">
-                          <a:solidFill>
-                            <a:srgbClr val="00B0F0"/>
-                          </a:solidFill>
-                          <a:tailEnd type="triangle"/>
-                        </a:ln>
-                      </wps:spPr>
-                      <wps:style>
-                        <a:lnRef idx="1">
-                          <a:schemeClr val="accent1"/>
-                        </a:lnRef>
-                        <a:fillRef idx="0">
-                          <a:schemeClr val="accent1"/>
-                        </a:fillRef>
-                        <a:effectRef idx="0">
-                          <a:schemeClr val="accent1"/>
-                        </a:effectRef>
-                        <a:fontRef idx="minor">
-                          <a:schemeClr val="tx1"/>
-                        </a:fontRef>
-                      </wps:style>
-                      <wps:bodyPr/>
-                    </wps:wsp>
-                  </a:graphicData>
-                </a:graphic>
-                <wp14:sizeRelH relativeFrom="margin">
-                  <wp14:pctWidth>0</wp14:pctWidth>
-                </wp14:sizeRelH>
-                <wp14:sizeRelV relativeFrom="margin">
-                  <wp14:pctHeight>0</wp14:pctHeight>
-                </wp14:sizeRelV>
-              </wp:anchor>
-            </w:drawing>
-          </mc:Choice>
-          <mc:Fallback>
-            <w:pict>
-              <v:shape w14:anchorId="241A7134" id="מחבר: מעוקל 1" o:spid="_x0000_s1026" type="#_x0000_t38" style="position:absolute;left:0;text-align:left;margin-left:-1.3pt;margin-top:16.3pt;width:159.85pt;height:115.7pt;flip:x y;z-index:251664384;visibility:visible;mso-wrap-style:square;mso-width-percent:0;mso-height-percent:0;mso-wrap-distance-left:9pt;mso-wrap-distance-top:0;mso-wrap-distance-right:9pt;mso-wrap-distance-bottom:0;mso-position-horizontal:absolute;mso-position-horizontal-relative:text;mso-position-vertical:absolute;mso-position-vertical-relative:text;mso-width-percent:0;mso-height-percent:0;mso-width-relative:margin;mso-height-relative:margin" o:gfxdata="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" adj="24294" strokecolor="#00b0f0" strokeweight="3pt">
-                <v:stroke endarrow="block" joinstyle="miter"/>
-              </v:shape>
-            </w:pict>
-          </mc:Fallback>
-        </mc:AlternateContent>
+        </w:rPr>
+        <w:pict w14:anchorId="623B3DEA">
+          <v:shape id="מחבר: מעוקל 5" o:spid="_x0000_s2051" type="#_x0000_t38" style="position:absolute;left:0;text-align:left;margin-left:-1.3pt;margin-top:16.3pt;width:159.85pt;height:115.7pt;flip:x y;z-index:251664384;visibility:visible;mso-wrap-style:square;mso-width-percent:0;mso-height-percent:0;mso-wrap-distance-left:9pt;mso-wrap-distance-top:0;mso-wrap-distance-right:9pt;mso-wrap-distance-bottom:0;mso-position-horizontal:absolute;mso-position-horizontal-relative:text;mso-position-vertical:absolute;mso-position-vertical-relative:text;mso-width-percent:0;mso-height-percent:0;mso-width-relative:margin;mso-height-relative:margin" o:gfxdata="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" adj="24294" strokecolor="#00b0f0" strokeweight="3pt">
+            <v:stroke endarrow="block" joinstyle="miter"/>
+          </v:shape>
+        </w:pict>
       </w:r>
     </w:p>
     <w:p>
@@ -11807,311 +11370,130 @@
       </w:pPr>
       <w:r>
         <w:rPr>
-          <w:rFonts w:ascii="Rubik" w:hAnsi="Rubik" w:cs="Rubik" w:hint="cs"/>
           <w:noProof/>
-          <w:sz w:val="20"/>
-          <w:szCs w:val="20"/>
-          <w:rtl/>
-          <w:lang w:val="he-IL"/>
-        </w:rPr>
-        <mc:AlternateContent>
-          <mc:Choice Requires="wps">
-            <w:drawing>
-              <wp:anchor distT="0" distB="0" distL="114300" distR="114300" simplePos="0" relativeHeight="251661312" behindDoc="0" locked="0" layoutInCell="1" allowOverlap="1" wp14:anchorId="08971F0E" wp14:editId="6CEC28B6">
-                <wp:simplePos x="0" y="0"/>
-                <wp:positionH relativeFrom="column">
-                  <wp:posOffset>2003229</wp:posOffset>
-                </wp:positionH>
-                <wp:positionV relativeFrom="paragraph">
-                  <wp:posOffset>107120</wp:posOffset>
-                </wp:positionV>
-                <wp:extent cx="1485900" cy="1502228"/>
-                <wp:effectExtent l="0" t="0" r="19050" b="22225"/>
-                <wp:wrapNone/>
-                <wp:docPr id="1846296482" name="תיבת טקסט 6"/>
-                <wp:cNvGraphicFramePr/>
-                <a:graphic xmlns:a="http://schemas.openxmlformats.org/drawingml/2006/main">
-                  <a:graphicData uri="http://schemas.microsoft.com/office/word/2010/wordprocessingShape">
-                    <wps:wsp>
-                      <wps:cNvSpPr txBox="1"/>
-                      <wps:spPr>
-                        <a:xfrm>
-                          <a:off x="0" y="0"/>
-                          <a:ext cx="1485900" cy="1502228"/>
-                        </a:xfrm>
-                        <a:prstGeom prst="rect">
-                          <a:avLst/>
-                        </a:prstGeom>
-                        <a:solidFill>
-                          <a:schemeClr val="lt1"/>
-                        </a:solidFill>
-                        <a:ln w="19050">
-                          <a:solidFill>
-                            <a:prstClr val="black"/>
-                          </a:solidFill>
-                        </a:ln>
-                      </wps:spPr>
-                      <wps:txbx>
-                        <w:txbxContent>
-                          <w:p>
-                            <w:pPr>
-                              <w:jc w:val="center"/>
-                              <w:rPr>
-                                <w:rFonts w:ascii="Rubik" w:hAnsi="Rubik" w:cs="Rubik"/>
-                                <w:b/>
-                                <w:bCs/>
-                                <w:sz w:val="24"/>
-                                <w:szCs w:val="24"/>
-                                <w:rtl/>
-                              </w:rPr>
-                            </w:pPr>
-                            <w:r>
-                              <w:rPr>
-                                <w:rFonts w:ascii="Rubik" w:hAnsi="Rubik" w:cs="Rubik"/>
-                                <w:b/>
-                                <w:bCs/>
-                                <w:sz w:val="24"/>
-                                <w:szCs w:val="24"/>
-                              </w:rPr>
-                              <w:t>User</w:t>
-                            </w:r>
-                          </w:p>
-                          <w:p>
-                            <w:pPr>
-                              <w:jc w:val="right"/>
-                              <w:rPr>
-                                <w:rFonts w:ascii="Rubik" w:hAnsi="Rubik" w:cs="Rubik"/>
-                                <w:sz w:val="24"/>
-                                <w:szCs w:val="24"/>
-                              </w:rPr>
-                            </w:pPr>
-                            <w:r>
-                              <w:rPr>
-                                <w:rFonts w:ascii="Rubik" w:hAnsi="Rubik" w:cs="Rubik"/>
-                                <w:sz w:val="24"/>
-                                <w:szCs w:val="24"/>
-                              </w:rPr>
-                              <w:t>Id (PK)</w:t>
-                            </w:r>
-                          </w:p>
-                          <w:p>
-                            <w:pPr>
-                              <w:jc w:val="right"/>
-                              <w:rPr>
-                                <w:rFonts w:ascii="Rubik" w:hAnsi="Rubik" w:cs="Rubik"/>
-                                <w:sz w:val="24"/>
-                                <w:szCs w:val="24"/>
-                              </w:rPr>
-                            </w:pPr>
-                            <w:r>
-                              <w:rPr>
-                                <w:rFonts w:ascii="Rubik" w:hAnsi="Rubik" w:cs="Rubik"/>
-                                <w:sz w:val="24"/>
-                                <w:szCs w:val="24"/>
-                              </w:rPr>
-                              <w:t>First_name</w:t>
-                            </w:r>
-                          </w:p>
-                          <w:p>
-                            <w:pPr>
-                              <w:jc w:val="right"/>
-                              <w:rPr>
-                                <w:rFonts w:ascii="Rubik" w:hAnsi="Rubik" w:cs="Rubik"/>
-                                <w:sz w:val="24"/>
-                                <w:szCs w:val="24"/>
-                              </w:rPr>
-                            </w:pPr>
-                            <w:r>
-                              <w:rPr>
-                                <w:rFonts w:ascii="Rubik" w:hAnsi="Rubik" w:cs="Rubik"/>
-                                <w:sz w:val="24"/>
-                                <w:szCs w:val="24"/>
-                              </w:rPr>
-                              <w:t>business_id</w:t>
-                            </w:r>
-                          </w:p>
-                          <w:p>
-                            <w:pPr>
-                              <w:jc w:val="right"/>
-                              <w:rPr>
-                                <w:rFonts w:ascii="Rubik" w:hAnsi="Rubik" w:cs="Rubik"/>
-                                <w:sz w:val="24"/>
-                                <w:szCs w:val="24"/>
-                              </w:rPr>
-                            </w:pPr>
-                            <w:r>
-                              <w:rPr>
-                                <w:rFonts w:ascii="Rubik" w:hAnsi="Rubik" w:cs="Rubik"/>
-                                <w:sz w:val="24"/>
-                                <w:szCs w:val="24"/>
-                              </w:rPr>
-                              <w:t>…</w:t>
-                            </w:r>
-                          </w:p>
-                          <w:p>
-                            <w:pPr>
-                              <w:spacing w:after="0" w:line="240" w:lineRule="auto"/>
-                              <w:jc w:val="right"/>
-                              <w:rPr>
-                                <w:rFonts w:ascii="Rubik" w:hAnsi="Rubik" w:cs="Rubik"/>
-                                <w:sz w:val="24"/>
-                                <w:szCs w:val="24"/>
-                              </w:rPr>
-                            </w:pPr>
-                            <w:r>
-                              <w:rPr>
-                                <w:rFonts w:ascii="Rubik" w:hAnsi="Rubik" w:cs="Rubik"/>
-                                <w:sz w:val="24"/>
-                                <w:szCs w:val="24"/>
-                              </w:rPr>
-                              <w:t>….</w:t>
-                            </w:r>
-                          </w:p>
-                        </w:txbxContent>
-                      </wps:txbx>
-                      <wps:bodyPr rot="0" spcFirstLastPara="0" vertOverflow="overflow" horzOverflow="overflow" vert="horz" wrap="square" lIns="91440" tIns="45720" rIns="91440" bIns="45720" numCol="1" spcCol="0" rtlCol="1" fromWordArt="0" anchor="t" anchorCtr="0" forceAA="0" compatLnSpc="1">
-                        <a:prstTxWarp prst="textNoShape">
-                          <a:avLst/>
-                        </a:prstTxWarp>
-                        <a:noAutofit/>
-                      </wps:bodyPr>
-                    </wps:wsp>
-                  </a:graphicData>
-                </a:graphic>
-                <wp14:sizeRelH relativeFrom="margin">
-                  <wp14:pctWidth>0</wp14:pctWidth>
-                </wp14:sizeRelH>
-                <wp14:sizeRelV relativeFrom="margin">
-                  <wp14:pctHeight>0</wp14:pctHeight>
-                </wp14:sizeRelV>
-              </wp:anchor>
-            </w:drawing>
-          </mc:Choice>
-          <mc:Fallback>
-            <w:pict>
-              <v:shape w14:anchorId="08971F0E" id="תיבת טקסט 6" o:spid="_x0000_s1028" type="#_x0000_t202" style="position:absolute;left:0;text-align:left;margin-left:157.75pt;margin-top:8.45pt;width:117pt;height:118.3pt;z-index:251661312;visibility:visible;mso-wrap-style:square;mso-width-percent:0;mso-height-percent:0;mso-wrap-distance-left:9pt;mso-wrap-distance-top:0;mso-wrap-distance-right:9pt;mso-wrap-distance-bottom:0;mso-position-horizontal:absolute;mso-position-horizontal-relative:text;mso-position-vertical:absolute;mso-position-vertical-relative:text;mso-width-percent:0;mso-height-percent:0;mso-width-relative:margin;mso-height-relative:margin;v-text-anchor:top" o:gfxdata="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" fillcolor="white [3201]" strokeweight="1.5pt">
-                <v:textbox>
-                  <w:txbxContent>
-                    <w:p>
-                      <w:pPr>
-                        <w:jc w:val="center"/>
-                        <w:rPr>
-                          <w:rFonts w:ascii="Rubik" w:hAnsi="Rubik" w:cs="Rubik"/>
-                          <w:b/>
-                          <w:bCs/>
-                          <w:sz w:val="24"/>
-                          <w:szCs w:val="24"/>
-                          <w:rtl/>
-                        </w:rPr>
-                      </w:pPr>
-                      <w:r>
-                        <w:rPr>
-                          <w:rFonts w:ascii="Rubik" w:hAnsi="Rubik" w:cs="Rubik"/>
-                          <w:b/>
-                          <w:bCs/>
-                          <w:sz w:val="24"/>
-                          <w:szCs w:val="24"/>
-                        </w:rPr>
-                        <w:t>User</w:t>
-                      </w:r>
-                    </w:p>
-                    <w:p>
-                      <w:pPr>
-                        <w:jc w:val="right"/>
-                        <w:rPr>
-                          <w:rFonts w:ascii="Rubik" w:hAnsi="Rubik" w:cs="Rubik"/>
-                          <w:sz w:val="24"/>
-                          <w:szCs w:val="24"/>
-                        </w:rPr>
-                      </w:pPr>
-                      <w:r>
-                        <w:rPr>
-                          <w:rFonts w:ascii="Rubik" w:hAnsi="Rubik" w:cs="Rubik"/>
-                          <w:sz w:val="24"/>
-                          <w:szCs w:val="24"/>
-                        </w:rPr>
-                        <w:t>Id (PK)</w:t>
-                      </w:r>
-                    </w:p>
-                    <w:p>
-                      <w:pPr>
-                        <w:jc w:val="right"/>
-                        <w:rPr>
-                          <w:rFonts w:ascii="Rubik" w:hAnsi="Rubik" w:cs="Rubik"/>
-                          <w:sz w:val="24"/>
-                          <w:szCs w:val="24"/>
-                        </w:rPr>
-                      </w:pPr>
-                      <w:r>
-                        <w:rPr>
-                          <w:rFonts w:ascii="Rubik" w:hAnsi="Rubik" w:cs="Rubik"/>
-                          <w:sz w:val="24"/>
-                          <w:szCs w:val="24"/>
-                        </w:rPr>
-                        <w:t>First_name</w:t>
-                      </w:r>
-                    </w:p>
-                    <w:p>
-                      <w:pPr>
-                        <w:jc w:val="right"/>
-                        <w:rPr>
-                          <w:rFonts w:ascii="Rubik" w:hAnsi="Rubik" w:cs="Rubik"/>
-                          <w:sz w:val="24"/>
-                          <w:szCs w:val="24"/>
-                        </w:rPr>
-                      </w:pPr>
-                      <w:r>
-                        <w:rPr>
-                          <w:rFonts w:ascii="Rubik" w:hAnsi="Rubik" w:cs="Rubik"/>
-                          <w:sz w:val="24"/>
-                          <w:szCs w:val="24"/>
-                        </w:rPr>
-                        <w:t>business_id</w:t>
-                      </w:r>
-                    </w:p>
-                    <w:p>
-                      <w:pPr>
-                        <w:jc w:val="right"/>
-                        <w:rPr>
-                          <w:rFonts w:ascii="Rubik" w:hAnsi="Rubik" w:cs="Rubik"/>
-                          <w:sz w:val="24"/>
-                          <w:szCs w:val="24"/>
-                        </w:rPr>
-                      </w:pPr>
-                      <w:r>
-                        <w:rPr>
-                          <w:rFonts w:ascii="Rubik" w:hAnsi="Rubik" w:cs="Rubik"/>
-                          <w:sz w:val="24"/>
-                          <w:szCs w:val="24"/>
-                        </w:rPr>
-                        <w:t>…</w:t>
-                      </w:r>
-                    </w:p>
-                    <w:p>
-                      <w:pPr>
-                        <w:spacing w:after="0" w:line="240" w:lineRule="auto"/>
-                        <w:jc w:val="right"/>
-                        <w:rPr>
-                          <w:rFonts w:ascii="Rubik" w:hAnsi="Rubik" w:cs="Rubik"/>
-                          <w:sz w:val="24"/>
-                          <w:szCs w:val="24"/>
-                        </w:rPr>
-                      </w:pPr>
-                      <w:r>
-                        <w:rPr>
-                          <w:rFonts w:ascii="Rubik" w:hAnsi="Rubik" w:cs="Rubik"/>
-                          <w:sz w:val="24"/>
-                          <w:szCs w:val="24"/>
-                        </w:rPr>
-                        <w:t>….</w:t>
-                      </w:r>
-                    </w:p>
-                  </w:txbxContent>
-                </v:textbox>
-              </v:shape>
-            </w:pict>
-          </mc:Fallback>
-        </mc:AlternateContent>
+        </w:rPr>
+        <w:pict w14:anchorId="4302B318">
+          <v:shape id="תיבת טקסט 6" o:spid="_x0000_s2050" type="#_x0000_t202" style="position:absolute;left:0;text-align:left;margin-left:157.75pt;margin-top:8.45pt;width:117pt;height:118.3pt;z-index:251661312;visibility:visible;mso-wrap-style:square;mso-width-percent:0;mso-height-percent:0;mso-wrap-distance-left:9pt;mso-wrap-distance-top:0;mso-wrap-distance-right:9pt;mso-wrap-distance-bottom:0;mso-position-horizontal:absolute;mso-position-horizontal-relative:text;mso-position-vertical:absolute;mso-position-vertical-relative:text;mso-width-percent:0;mso-height-percent:0;mso-width-relative:margin;mso-height-relative:margin;v-text-anchor:top" o:gfxdata="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" fillcolor="white [3201]" strokeweight="1.5pt">
+            <v:textbox>
+              <w:txbxContent>
+                <w:p>
+                  <w:pPr>
+                    <w:jc w:val="center"/>
+                    <w:rPr>
+                      <w:rFonts w:ascii="Rubik" w:hAnsi="Rubik" w:cs="Rubik"/>
+                      <w:b/>
+                      <w:bCs/>
+                      <w:sz w:val="24"/>
+                      <w:szCs w:val="24"/>
+                      <w:rtl/>
+                    </w:rPr>
+                  </w:pPr>
+                  <w:r>
+                    <w:rPr>
+                      <w:rFonts w:ascii="Rubik" w:hAnsi="Rubik" w:cs="Rubik"/>
+                      <w:b/>
+                      <w:bCs/>
+                      <w:sz w:val="24"/>
+                      <w:szCs w:val="24"/>
+                    </w:rPr>
+                    <w:t>User</w:t>
+                  </w:r>
+                </w:p>
+                <w:p>
+                  <w:pPr>
+                    <w:jc w:val="right"/>
+                    <w:rPr>
+                      <w:rFonts w:ascii="Rubik" w:hAnsi="Rubik" w:cs="Rubik"/>
+                      <w:sz w:val="24"/>
+                      <w:szCs w:val="24"/>
+                    </w:rPr>
+                  </w:pPr>
+                  <w:r>
+                    <w:rPr>
+                      <w:rFonts w:ascii="Rubik" w:hAnsi="Rubik" w:cs="Rubik"/>
+                      <w:sz w:val="24"/>
+                      <w:szCs w:val="24"/>
+                    </w:rPr>
+                    <w:t>Id (PK)</w:t>
+                  </w:r>
+                </w:p>
+                <w:p>
+                  <w:pPr>
+                    <w:jc w:val="right"/>
+                    <w:rPr>
+                      <w:rFonts w:ascii="Rubik" w:hAnsi="Rubik" w:cs="Rubik"/>
+                      <w:sz w:val="24"/>
+                      <w:szCs w:val="24"/>
+                    </w:rPr>
+                  </w:pPr>
+                  <w:r>
+                    <w:rPr>
+                      <w:rFonts w:ascii="Rubik" w:hAnsi="Rubik" w:cs="Rubik"/>
+                      <w:sz w:val="24"/>
+                      <w:szCs w:val="24"/>
+                    </w:rPr>
+                    <w:t>First_name</w:t>
+                  </w:r>
+                </w:p>
+                <w:p>
+                  <w:pPr>
+                    <w:jc w:val="right"/>
+                    <w:rPr>
+                      <w:rFonts w:ascii="Rubik" w:hAnsi="Rubik" w:cs="Rubik"/>
+                      <w:sz w:val="24"/>
+                      <w:szCs w:val="24"/>
+                    </w:rPr>
+                  </w:pPr>
+                  <w:r>
+                    <w:rPr>
+                      <w:rFonts w:ascii="Rubik" w:hAnsi="Rubik" w:cs="Rubik"/>
+                      <w:sz w:val="24"/>
+                      <w:szCs w:val="24"/>
+                    </w:rPr>
+                    <w:t>business_id</w:t>
+                  </w:r>
+                </w:p>
+                <w:p>
+                  <w:pPr>
+                    <w:jc w:val="right"/>
+                    <w:rPr>
+                      <w:rFonts w:ascii="Rubik" w:hAnsi="Rubik" w:cs="Rubik"/>
+                      <w:sz w:val="24"/>
+                      <w:szCs w:val="24"/>
+                    </w:rPr>
+                  </w:pPr>
+                  <w:r>
+                    <w:rPr>
+                      <w:rFonts w:ascii="Rubik" w:hAnsi="Rubik" w:cs="Rubik"/>
+                      <w:sz w:val="24"/>
+                      <w:szCs w:val="24"/>
+                    </w:rPr>
+                    <w:t>…</w:t>
+                  </w:r>
+                </w:p>
+                <w:p>
+                  <w:pPr>
+                    <w:spacing w:after="0" w:line="240" w:lineRule="auto"/>
+                    <w:jc w:val="right"/>
+                    <w:rPr>
+                      <w:rFonts w:ascii="Rubik" w:hAnsi="Rubik" w:cs="Rubik"/>
+                      <w:sz w:val="24"/>
+                      <w:szCs w:val="24"/>
+                    </w:rPr>
+                  </w:pPr>
+                  <w:r>
+                    <w:rPr>
+                      <w:rFonts w:ascii="Rubik" w:hAnsi="Rubik" w:cs="Rubik"/>
+                      <w:sz w:val="24"/>
+                      <w:szCs w:val="24"/>
+                    </w:rPr>
+                    <w:t>….</w:t>
+                  </w:r>
+                </w:p>
+              </w:txbxContent>
+            </v:textbox>
+          </v:shape>
+        </w:pict>
       </w:r>
     </w:p>
     <w:p>
@@ -12309,7 +11691,7 @@
     <w:pPr>
       <w:pStyle w:val="a3"/>
       <w:rPr>
-        <w:rFonts w:ascii="Rubik" w:hAnsi="Rubik" w:cs="Rubik" w:hint="cs"/>
+        <w:rFonts w:ascii="Rubik" w:hAnsi="Rubik" w:cs="Rubik"/>
         <w:color w:val="0070C0"/>
         <w:sz w:val="16"/>
         <w:szCs w:val="16"/>
@@ -12318,138 +11700,39 @@
     </w:pPr>
     <w:r>
       <w:rPr>
-        <w:rFonts w:ascii="Rubik" w:hAnsi="Rubik" w:cs="Rubik"/>
         <w:noProof/>
-        <w:color w:val="0070C0"/>
-        <w:sz w:val="16"/>
-        <w:szCs w:val="16"/>
-        <w:rtl/>
-        <w:lang w:val="he-IL"/>
-      </w:rPr>
-      <mc:AlternateContent>
-        <mc:Choice Requires="wps">
-          <w:drawing>
-            <wp:anchor distT="0" distB="0" distL="114300" distR="114300" simplePos="0" relativeHeight="251659264" behindDoc="0" locked="0" layoutInCell="1" allowOverlap="1" wp14:anchorId="74C84B99" wp14:editId="636D4888">
-              <wp:simplePos x="0" y="0"/>
-              <wp:positionH relativeFrom="column">
-                <wp:posOffset>1615440</wp:posOffset>
-              </wp:positionH>
-              <wp:positionV relativeFrom="paragraph">
-                <wp:posOffset>-180340</wp:posOffset>
-              </wp:positionV>
-              <wp:extent cx="2153920" cy="441960"/>
-              <wp:effectExtent l="0" t="0" r="0" b="0"/>
-              <wp:wrapNone/>
-              <wp:docPr id="1707009594" name="תיבת טקסט 7"/>
-              <wp:cNvGraphicFramePr/>
-              <a:graphic xmlns:a="http://schemas.openxmlformats.org/drawingml/2006/main">
-                <a:graphicData uri="http://schemas.microsoft.com/office/word/2010/wordprocessingShape">
-                  <wps:wsp>
-                    <wps:cNvSpPr txBox="1"/>
-                    <wps:spPr>
-                      <a:xfrm>
-                        <a:off x="0" y="0"/>
-                        <a:ext cx="2153920" cy="441960"/>
-                      </a:xfrm>
-                      <a:prstGeom prst="rect">
-                        <a:avLst/>
-                      </a:prstGeom>
-                      <a:solidFill>
-                        <a:schemeClr val="lt1"/>
-                      </a:solidFill>
-                      <a:ln w="6350">
-                        <a:noFill/>
-                      </a:ln>
-                    </wps:spPr>
-                    <wps:txbx>
-                      <w:txbxContent>
-                        <w:p>
-                          <w:pPr>
-                            <w:jc w:val="center"/>
-                            <w:rPr>
-                              <w:color w:val="000000" w:themeColor="text1"/>
-                              <w:sz w:val="48"/>
-                              <w:szCs w:val="48"/>
-                              <w14:glow w14:rad="63500">
-                                <w14:srgbClr w14:val="0070C0">
-                                  <w14:alpha w14:val="60000"/>
-                                </w14:srgbClr>
-                              </w14:glow>
-                            </w:rPr>
-                          </w:pPr>
-                          <w:r>
-                            <w:rPr>
-                              <w:rFonts w:ascii="Rubik" w:hAnsi="Rubik" w:cs="Rubik"/>
-                              <w:color w:val="000000" w:themeColor="text1"/>
-                              <w:sz w:val="36"/>
-                              <w:szCs w:val="36"/>
-                              <w14:glow w14:rad="63500">
-                                <w14:srgbClr w14:val="0070C0">
-                                  <w14:alpha w14:val="60000"/>
-                                </w14:srgbClr>
-                              </w14:glow>
-                            </w:rPr>
-                            <w:t>BusinessMan</w:t>
-                          </w:r>
-                        </w:p>
-                      </w:txbxContent>
-                    </wps:txbx>
-                    <wps:bodyPr rot="0" spcFirstLastPara="0" vertOverflow="overflow" horzOverflow="overflow" vert="horz" wrap="square" lIns="91440" tIns="45720" rIns="91440" bIns="45720" numCol="1" spcCol="0" rtlCol="1" fromWordArt="0" anchor="t" anchorCtr="0" forceAA="0" compatLnSpc="1">
-                      <a:prstTxWarp prst="textNoShape">
-                        <a:avLst/>
-                      </a:prstTxWarp>
-                      <a:noAutofit/>
-                    </wps:bodyPr>
-                  </wps:wsp>
-                </a:graphicData>
-              </a:graphic>
-            </wp:anchor>
-          </w:drawing>
-        </mc:Choice>
-        <mc:Fallback>
-          <w:pict>
-            <v:shapetype w14:anchorId="74C84B99" id="_x0000_t202" coordsize="21600,21600" o:spt="202" path="m,l,21600r21600,l21600,xe">
-              <v:stroke joinstyle="miter"/>
-              <v:path gradientshapeok="t" o:connecttype="rect"/>
-            </v:shapetype>
-            <v:shape id="תיבת טקסט 7" o:spid="_x0000_s1029" type="#_x0000_t202" style="position:absolute;left:0;text-align:left;margin-left:127.2pt;margin-top:-14.2pt;width:169.6pt;height:34.8pt;z-index:251659264;visibility:visible;mso-wrap-style:square;mso-wrap-distance-left:9pt;mso-wrap-distance-top:0;mso-wrap-distance-right:9pt;mso-wrap-distance-bottom:0;mso-position-horizontal:absolute;mso-position-horizontal-relative:text;mso-position-vertical:absolute;mso-position-vertical-relative:text;v-text-anchor:top" o:gfxdata="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" fillcolor="white [3201]" stroked="f" strokeweight=".5pt">
-              <v:textbox>
-                <w:txbxContent>
-                  <w:p>
-                    <w:pPr>
-                      <w:jc w:val="center"/>
-                      <w:rPr>
-                        <w:color w:val="000000" w:themeColor="text1"/>
-                        <w:sz w:val="48"/>
-                        <w:szCs w:val="48"/>
-                        <w14:glow w14:rad="63500">
-                          <w14:srgbClr w14:val="0070C0">
-                            <w14:alpha w14:val="60000"/>
-                          </w14:srgbClr>
-                        </w14:glow>
-                      </w:rPr>
-                    </w:pPr>
-                    <w:r>
-                      <w:rPr>
-                        <w:rFonts w:ascii="Rubik" w:hAnsi="Rubik" w:cs="Rubik"/>
-                        <w:color w:val="000000" w:themeColor="text1"/>
-                        <w:sz w:val="36"/>
-                        <w:szCs w:val="36"/>
-                        <w14:glow w14:rad="63500">
-                          <w14:srgbClr w14:val="0070C0">
-                            <w14:alpha w14:val="60000"/>
-                          </w14:srgbClr>
-                        </w14:glow>
-                      </w:rPr>
-                      <w:t>BusinessMan</w:t>
-                    </w:r>
-                  </w:p>
-                </w:txbxContent>
-              </v:textbox>
-            </v:shape>
-          </w:pict>
-        </mc:Fallback>
-      </mc:AlternateContent>
+      </w:rPr>
+      <w:pict w14:anchorId="5EBF8001">
+        <v:shapetype id="_x0000_t202" coordsize="21600,21600" o:spt="202" path="m,l,21600r21600,l21600,xe">
+          <v:stroke joinstyle="miter"/>
+          <v:path gradientshapeok="t" o:connecttype="rect"/>
+        </v:shapetype>
+        <v:shape id="תיבת טקסט 7" o:spid="_x0000_s1025" type="#_x0000_t202" style="position:absolute;left:0;text-align:left;margin-left:127.2pt;margin-top:-14.2pt;width:169.6pt;height:34.8pt;z-index:251659264;visibility:visible;mso-wrap-style:square;mso-wrap-distance-left:9pt;mso-wrap-distance-top:0;mso-wrap-distance-right:9pt;mso-wrap-distance-bottom:0;mso-position-horizontal:absolute;mso-position-horizontal-relative:text;mso-position-vertical:absolute;mso-position-vertical-relative:text;v-text-anchor:top" o:gfxdata="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" fillcolor="white [3201]" stroked="f" strokeweight=".5pt">
+          <v:textbox>
+            <w:txbxContent>
+              <w:p>
+                <w:pPr>
+                  <w:jc w:val="center"/>
+                  <w:rPr>
+                    <w:color w:val="000000" w:themeColor="text1"/>
+                    <w:sz w:val="48"/>
+                    <w:szCs w:val="48"/>
+                  </w:rPr>
+                </w:pPr>
+                <w:r>
+                  <w:rPr>
+                    <w:rFonts w:ascii="Rubik" w:hAnsi="Rubik" w:cs="Rubik"/>
+                    <w:color w:val="000000" w:themeColor="text1"/>
+                    <w:sz w:val="36"/>
+                    <w:szCs w:val="36"/>
+                  </w:rPr>
+                  <w:t>BusinessMan</w:t>
+                </w:r>
+              </w:p>
+            </w:txbxContent>
+          </v:textbox>
+        </v:shape>
+      </w:pict>
     </w:r>
     <w:r>
       <w:rPr>
@@ -12476,7 +11759,7 @@
     <w:pPr>
       <w:pStyle w:val="a3"/>
       <w:rPr>
-        <w:rFonts w:ascii="Rubik" w:hAnsi="Rubik" w:cs="Rubik" w:hint="cs"/>
+        <w:rFonts w:ascii="Rubik" w:hAnsi="Rubik" w:cs="Rubik"/>
         <w:color w:val="0070C0"/>
         <w:sz w:val="16"/>
         <w:szCs w:val="16"/>

</xml_diff>